<commit_message>
Added checkout step indicator to cart page and fixed layout structure
</commit_message>
<xml_diff>
--- a/Thomas Goodman5113852 BIT 703 Assessment 2.docx
+++ b/Thomas Goodman5113852 BIT 703 Assessment 2.docx
@@ -212,31 +212,7 @@
     </w:p>
     <w:p>
       <w:r>
-        <w:t>Suitable HTML5 form elements and attributes were applied across the checkout pages. For example, type="email" was used for newsletter input, type="</w:t>
-      </w:r>
-      <w:proofErr w:type="spellStart"/>
-      <w:r>
-        <w:t>tel</w:t>
-      </w:r>
-      <w:proofErr w:type="spellEnd"/>
-      <w:r>
-        <w:t xml:space="preserve">" was used for phone numbers, required was added to mandatory fields, </w:t>
-      </w:r>
-      <w:proofErr w:type="spellStart"/>
-      <w:r>
-        <w:t>minlength</w:t>
-      </w:r>
-      <w:proofErr w:type="spellEnd"/>
-      <w:r>
-        <w:t xml:space="preserve"> and </w:t>
-      </w:r>
-      <w:proofErr w:type="spellStart"/>
-      <w:r>
-        <w:t>maxlength</w:t>
-      </w:r>
-      <w:proofErr w:type="spellEnd"/>
-      <w:r>
-        <w:t xml:space="preserve"> were used for text inputs, and pattern was used for fields such as postal codes, CVV values, expiry date formatting, and credit card numbers. These features provided immediate browser-based validation before submission.</w:t>
+        <w:t>Suitable HTML5 form elements and attributes were applied across the checkout pages. For example, type="email" was used for newsletter input, type="tel" was used for phone numbers, required was added to mandatory fields, minlength and maxlength were used for text inputs, and pattern was used for fields such as postal codes, CVV values, expiry date formatting, and credit card numbers. These features provided immediate browser-based validation before submission.</w:t>
       </w:r>
     </w:p>
     <w:p>
@@ -256,6 +232,93 @@
           <w:bCs/>
         </w:rPr>
       </w:pPr>
+    </w:p>
+    <w:p>
+      <w:pPr>
+        <w:rPr>
+          <w:b/>
+          <w:bCs/>
+        </w:rPr>
+      </w:pPr>
+    </w:p>
+    <w:p>
+      <w:pPr>
+        <w:rPr>
+          <w:b/>
+          <w:bCs/>
+        </w:rPr>
+      </w:pPr>
+    </w:p>
+    <w:p>
+      <w:pPr>
+        <w:rPr>
+          <w:b/>
+          <w:bCs/>
+        </w:rPr>
+      </w:pPr>
+    </w:p>
+    <w:p>
+      <w:pPr>
+        <w:rPr>
+          <w:b/>
+          <w:bCs/>
+        </w:rPr>
+      </w:pPr>
+    </w:p>
+    <w:p>
+      <w:pPr>
+        <w:rPr>
+          <w:b/>
+          <w:bCs/>
+        </w:rPr>
+      </w:pPr>
+    </w:p>
+    <w:p>
+      <w:pPr>
+        <w:rPr>
+          <w:b/>
+          <w:bCs/>
+        </w:rPr>
+      </w:pPr>
+    </w:p>
+    <w:p>
+      <w:pPr>
+        <w:rPr>
+          <w:b/>
+          <w:bCs/>
+        </w:rPr>
+      </w:pPr>
+    </w:p>
+    <w:p>
+      <w:pPr>
+        <w:rPr>
+          <w:b/>
+          <w:bCs/>
+        </w:rPr>
+      </w:pPr>
+    </w:p>
+    <w:p>
+      <w:pPr>
+        <w:rPr>
+          <w:b/>
+          <w:bCs/>
+        </w:rPr>
+      </w:pPr>
+      <w:r>
+        <w:rPr>
+          <w:b/>
+          <w:bCs/>
+        </w:rPr>
+        <w:lastRenderedPageBreak/>
+        <w:t xml:space="preserve">Site URL </w:t>
+      </w:r>
+      <w:r>
+        <w:rPr>
+          <w:b/>
+          <w:bCs/>
+        </w:rPr>
+        <w:t>https://thomasgoodman2000.github.io/BIT703-A2/index.html</w:t>
+      </w:r>
     </w:p>
     <w:sectPr>
       <w:pgSz w:w="11906" w:h="16838"/>

</xml_diff>